<commit_message>
Creado documento para ideas y cosas pendientes
</commit_message>
<xml_diff>
--- a/Cosas pendientes.docx
+++ b/Cosas pendientes.docx
@@ -75,6 +75,49 @@
       </w:pPr>
       <w:r>
         <w:t>Comentarios:</w:t>
+      </w:r>
+    </w:p>
+    <w:p/>
+    <w:p>
+      <w:pPr>
+        <w:pStyle w:val="Ttulo2"/>
+      </w:pPr>
+      <w:proofErr w:type="spellStart"/>
+      <w:r>
+        <w:t>Prompt</w:t>
+      </w:r>
+      <w:proofErr w:type="spellEnd"/>
+      <w:r>
+        <w:t xml:space="preserve"> para </w:t>
+      </w:r>
+      <w:proofErr w:type="spellStart"/>
+      <w:r>
+        <w:t>chati</w:t>
+      </w:r>
+      <w:proofErr w:type="spellEnd"/>
+      <w:r>
+        <w:t>:</w:t>
+      </w:r>
+    </w:p>
+    <w:p>
+      <w:r>
+        <w:t xml:space="preserve">A ver te explico bien lo que necesito. Con </w:t>
+      </w:r>
+      <w:proofErr w:type="spellStart"/>
+      <w:r>
+        <w:t>moises</w:t>
+      </w:r>
+      <w:proofErr w:type="spellEnd"/>
+      <w:r>
+        <w:t xml:space="preserve"> necesito separar la instrumental de la voz. De manera que me quede un mp3 de la instrumental. Por otro lado otro mp3 de la voz, con el cual yo se lo pase a otra aplicación y me genere la transcripción al ritmo de la </w:t>
+      </w:r>
+      <w:proofErr w:type="gramStart"/>
+      <w:r>
+        <w:t>voz..</w:t>
+      </w:r>
+      <w:proofErr w:type="gramEnd"/>
+      <w:r>
+        <w:t xml:space="preserve"> Si ya consigo montar un video con la instrumental y la transcripción sincronizada pues lo petamos</w:t>
       </w:r>
     </w:p>
     <w:p>
@@ -634,6 +677,28 @@
       <w:szCs w:val="32"/>
     </w:rPr>
   </w:style>
+  <w:style w:type="paragraph" w:styleId="Ttulo2">
+    <w:name w:val="heading 2"/>
+    <w:basedOn w:val="Normal"/>
+    <w:next w:val="Normal"/>
+    <w:link w:val="Ttulo2Car"/>
+    <w:uiPriority w:val="9"/>
+    <w:unhideWhenUsed/>
+    <w:qFormat/>
+    <w:rsid w:val="00FE7202"/>
+    <w:pPr>
+      <w:keepNext/>
+      <w:keepLines/>
+      <w:spacing w:before="40" w:after="0"/>
+      <w:outlineLvl w:val="1"/>
+    </w:pPr>
+    <w:rPr>
+      <w:rFonts w:asciiTheme="majorHAnsi" w:eastAsiaTheme="majorEastAsia" w:hAnsiTheme="majorHAnsi" w:cstheme="majorBidi"/>
+      <w:color w:val="2F5496" w:themeColor="accent1" w:themeShade="BF"/>
+      <w:sz w:val="26"/>
+      <w:szCs w:val="26"/>
+    </w:rPr>
+  </w:style>
   <w:style w:type="character" w:default="1" w:styleId="Fuentedeprrafopredeter">
     <w:name w:val="Default Paragraph Font"/>
     <w:uiPriority w:val="1"/>
@@ -683,6 +748,19 @@
       <w:color w:val="2F5496" w:themeColor="accent1" w:themeShade="BF"/>
       <w:sz w:val="32"/>
       <w:szCs w:val="32"/>
+    </w:rPr>
+  </w:style>
+  <w:style w:type="character" w:customStyle="1" w:styleId="Ttulo2Car">
+    <w:name w:val="Título 2 Car"/>
+    <w:basedOn w:val="Fuentedeprrafopredeter"/>
+    <w:link w:val="Ttulo2"/>
+    <w:uiPriority w:val="9"/>
+    <w:rsid w:val="00FE7202"/>
+    <w:rPr>
+      <w:rFonts w:asciiTheme="majorHAnsi" w:eastAsiaTheme="majorEastAsia" w:hAnsiTheme="majorHAnsi" w:cstheme="majorBidi"/>
+      <w:color w:val="2F5496" w:themeColor="accent1" w:themeShade="BF"/>
+      <w:sz w:val="26"/>
+      <w:szCs w:val="26"/>
     </w:rPr>
   </w:style>
 </w:styles>

</xml_diff>

<commit_message>
creada pagina de edicion de usuarios y bloqueo
</commit_message>
<xml_diff>
--- a/Cosas pendientes.docx
+++ b/Cosas pendientes.docx
@@ -58,66 +58,67 @@
         <w:t>Cosas pendientes prioridad BAJA:</w:t>
       </w:r>
     </w:p>
+    <w:p>
+      <w:pPr>
+        <w:rPr>
+          <w:u w:val="single"/>
+        </w:rPr>
+      </w:pPr>
+    </w:p>
+    <w:p>
+      <w:pPr>
+        <w:pStyle w:val="Prrafodelista"/>
+        <w:numPr>
+          <w:ilvl w:val="0"/>
+          <w:numId w:val="1"/>
+        </w:numPr>
+      </w:pPr>
+      <w:r>
+        <w:t xml:space="preserve">mirar la unificación de estilos para todos </w:t>
+      </w:r>
+    </w:p>
+    <w:p>
+      <w:pPr>
+        <w:pStyle w:val="Prrafodelista"/>
+        <w:numPr>
+          <w:ilvl w:val="0"/>
+          <w:numId w:val="1"/>
+        </w:numPr>
+      </w:pPr>
+      <w:r>
+        <w:t>hacer que el admin no pueda modificar datos de usuario normal pero si listar y bloquear/borrar</w:t>
+      </w:r>
+    </w:p>
     <w:p/>
+    <w:p>
+      <w:pPr>
+        <w:pStyle w:val="Ttulo1"/>
+      </w:pPr>
+      <w:r>
+        <w:t>Ideas:</w:t>
+      </w:r>
+    </w:p>
     <w:p/>
     <w:p>
       <w:pPr>
         <w:pStyle w:val="Ttulo1"/>
       </w:pPr>
       <w:r>
-        <w:t>Ideas:</w:t>
+        <w:t>Comentarios:</w:t>
       </w:r>
     </w:p>
     <w:p/>
     <w:p>
       <w:pPr>
-        <w:pStyle w:val="Ttulo1"/>
-      </w:pPr>
-      <w:r>
-        <w:t>Comentarios:</w:t>
-      </w:r>
-    </w:p>
-    <w:p/>
-    <w:p>
-      <w:pPr>
         <w:pStyle w:val="Ttulo2"/>
       </w:pPr>
-      <w:proofErr w:type="spellStart"/>
-      <w:r>
-        <w:t>Prompt</w:t>
-      </w:r>
-      <w:proofErr w:type="spellEnd"/>
-      <w:r>
-        <w:t xml:space="preserve"> para </w:t>
-      </w:r>
-      <w:proofErr w:type="spellStart"/>
-      <w:r>
-        <w:t>chati</w:t>
-      </w:r>
-      <w:proofErr w:type="spellEnd"/>
-      <w:r>
-        <w:t>:</w:t>
-      </w:r>
-    </w:p>
-    <w:p>
-      <w:r>
-        <w:t xml:space="preserve">A ver te explico bien lo que necesito. Con </w:t>
-      </w:r>
-      <w:proofErr w:type="spellStart"/>
-      <w:r>
-        <w:t>moises</w:t>
-      </w:r>
-      <w:proofErr w:type="spellEnd"/>
-      <w:r>
-        <w:t xml:space="preserve"> necesito separar la instrumental de la voz. De manera que me quede un mp3 de la instrumental. Por otro lado otro mp3 de la voz, con el cual yo se lo pase a otra aplicación y me genere la transcripción al ritmo de la </w:t>
-      </w:r>
-      <w:proofErr w:type="gramStart"/>
-      <w:r>
-        <w:t>voz..</w:t>
-      </w:r>
-      <w:proofErr w:type="gramEnd"/>
-      <w:r>
-        <w:t xml:space="preserve"> Si ya consigo montar un video con la instrumental y la transcripción sincronizada pues lo petamos</w:t>
+      <w:r>
+        <w:t>Prompt para chati:</w:t>
+      </w:r>
+    </w:p>
+    <w:p>
+      <w:r>
+        <w:t>A ver te explico bien lo que necesito. Con moises necesito separar la instrumental de la voz. De manera que me quede un mp3 de la instrumental. Por otro lado otro mp3 de la voz, con el cual yo se lo pase a otra aplicación y me genere la transcripción al ritmo de la voz.. Si ya consigo montar un video con la instrumental y la transcripción sincronizada pues lo petamos</w:t>
       </w:r>
     </w:p>
     <w:p>

</xml_diff>